<commit_message>
feat: expand applied AI portfolio and align CV claims
</commit_message>
<xml_diff>
--- a/public/cv-prompt-engineer.docx
+++ b/public/cv-prompt-engineer.docx
@@ -4,297 +4,194 @@
   <w:body>
     <w:p>
       <w:pPr>
-        <w:keepNext/>
-        <w:keepLines/>
-        <w:spacing w:after="60"/>
+        <w:pStyle w:val="Title"/>
       </w:pPr>
       <w:r>
-        <w:rPr>
-          <w:b/>
-          <w:color w:val="16354D"/>
-          <w:sz w:val="48"/>
-        </w:rPr>
         <w:t>NGUYEN QUANG DUY</w:t>
       </w:r>
     </w:p>
     <w:p>
-      <w:pPr>
-        <w:keepNext/>
-        <w:keepLines/>
-        <w:spacing w:after="100"/>
-      </w:pPr>
       <w:r>
-        <w:rPr>
-          <w:b/>
-          <w:color w:val="225E7C"/>
-          <w:sz w:val="21"/>
-        </w:rPr>
-        <w:t>JUNIOR AI / PROMPT ENGINEER | PYTHON | RAG | LLM APPLICATIONS</w:t>
+        <w:t>AI AND PROMPT ENGINEER | RAG PROTOTYPES | PYTHON</w:t>
+      </w:r>
+    </w:p>
+    <w:p>
+      <w:r>
+        <w:t>Ho Chi Minh City, Vietnam  |  0902577827  |  nquangd1510@gmail.com</w:t>
+      </w:r>
+    </w:p>
+    <w:p>
+      <w:r>
+        <w:t>Portfolio: https://duytruyenthong.github.io/Alinguyen-portfolio/</w:t>
       </w:r>
     </w:p>
     <w:p>
       <w:pPr>
-        <w:keepNext/>
-        <w:keepLines/>
-        <w:spacing w:after="60"/>
+        <w:pStyle w:val="Heading1"/>
       </w:pPr>
       <w:r>
-        <w:rPr>
-          <w:sz w:val="19"/>
-        </w:rPr>
-        <w:t>Ho Chi Minh City, Vietnam | 0902577827 | nquangd1510@gmail.com</w:t>
+        <w:t>PROFILE</w:t>
+      </w:r>
+    </w:p>
+    <w:p>
+      <w:r>
+        <w:t>Computer Science graduate building applied AI prototypes, customer-data workflows and digital products. Work spans retrieval and prompt design, a leakage-checked local churn baseline, public developer tooling and live commerce websites. I bring enterprise troubleshooting and client discovery to scoping, testing and explaining technical work.</w:t>
       </w:r>
     </w:p>
     <w:p>
       <w:pPr>
-        <w:keepNext/>
-        <w:keepLines/>
-        <w:spacing w:after="60"/>
+        <w:pStyle w:val="Heading1"/>
       </w:pPr>
       <w:r>
+        <w:t>RELEVANT SKILLS</w:t>
+      </w:r>
+    </w:p>
+    <w:p>
+      <w:r>
         <w:rPr>
-          <w:sz w:val="19"/>
+          <w:b/>
         </w:rPr>
-        <w:t>Portfolio: duytruyenthong.li2.sh/duytruyenthong</w:t>
+        <w:t xml:space="preserve">Applied AI: </w:t>
+      </w:r>
+      <w:r>
+        <w:t>LLM API and prompt workflows; retrieval-augmented generation prototypes; response review and documentation.</w:t>
+      </w:r>
+    </w:p>
+    <w:p>
+      <w:r>
+        <w:rPr>
+          <w:b/>
+        </w:rPr>
+        <w:t xml:space="preserve">Data and evaluation: </w:t>
+      </w:r>
+      <w:r>
+        <w:t>Python, SQL, PostgreSQL, Pandas, scikit-learn, snapshot-date features and holdout evaluation.</w:t>
+      </w:r>
+    </w:p>
+    <w:p>
+      <w:r>
+        <w:rPr>
+          <w:b/>
+        </w:rPr>
+        <w:t xml:space="preserve">Product engineering: </w:t>
+      </w:r>
+      <w:r>
+        <w:t>JavaScript, TypeScript, React, Next.js, Node.js, GitHub Actions, debugging and testing.</w:t>
+      </w:r>
+    </w:p>
+    <w:p>
+      <w:r>
+        <w:rPr>
+          <w:b/>
+        </w:rPr>
+        <w:t xml:space="preserve">Business context: </w:t>
+      </w:r>
+      <w:r>
+        <w:t>Requirements discovery, commerce analytics, sales funnels and stakeholder communication.</w:t>
       </w:r>
     </w:p>
     <w:p>
       <w:pPr>
-        <w:keepNext/>
-        <w:keepLines/>
-        <w:spacing w:before="200" w:after="100"/>
-        <w:pBdr>
-          <w:bottom w:val="single" w:sz="4" w:color="CCD8E0"/>
-        </w:pBdr>
+        <w:pStyle w:val="Heading1"/>
       </w:pPr>
       <w:r>
-        <w:rPr>
-          <w:b/>
-          <w:color w:val="225E7C"/>
-          <w:sz w:val="21"/>
-        </w:rPr>
-        <w:t>PROFILE</w:t>
+        <w:t>SELECTED AI AND PRODUCT WORK</w:t>
       </w:r>
     </w:p>
     <w:p>
       <w:pPr>
-        <w:keepLines/>
+        <w:pStyle w:val="Heading2"/>
       </w:pPr>
       <w:r>
-        <w:t>Technology professional with a Computer Science background and project experience in LLM APIs, retrieval-augmented generation and machine learning. Combines enterprise troubleshooting, software development and client discovery to translate requirements into testable AI prototypes and business-focused data workflows.</w:t>
+        <w:t>AI Knowledge Assistant | Retrieval and prompt prototype</w:t>
       </w:r>
     </w:p>
     <w:p>
       <w:pPr>
-        <w:keepNext/>
-        <w:keepLines/>
-        <w:spacing w:before="200" w:after="100"/>
-        <w:pBdr>
-          <w:bottom w:val="single" w:sz="4" w:color="CCD8E0"/>
-        </w:pBdr>
+        <w:pStyle w:val="ListBullet"/>
       </w:pPr>
       <w:r>
-        <w:rPr>
-          <w:b/>
-          <w:color w:val="225E7C"/>
-          <w:sz w:val="21"/>
-        </w:rPr>
-        <w:t>RELEVANT SKILLS</w:t>
+        <w:t>Designed a retrieval-plus-generation flow for answering questions from internal knowledge sources.</w:t>
       </w:r>
     </w:p>
     <w:p>
       <w:pPr>
-        <w:keepLines/>
-        <w:spacing w:after="60"/>
+        <w:pStyle w:val="ListBullet"/>
       </w:pPr>
       <w:r>
-        <w:rPr>
-          <w:b/>
-        </w:rPr>
-        <w:t>AI applications:</w:t>
-      </w:r>
-      <w:r>
-        <w:t xml:space="preserve"> Gemini API, prompt engineering, semantic retrieval, RAG and AI-agent concepts.</w:t>
+        <w:t>Prototyped prompt and retrieval steps and reviewed responses to representative knowledge questions. No production deployment or measured accuracy is claimed.</w:t>
       </w:r>
     </w:p>
     <w:p>
       <w:pPr>
-        <w:keepLines/>
-        <w:spacing w:after="60"/>
+        <w:pStyle w:val="Heading2"/>
       </w:pPr>
       <w:r>
-        <w:rPr>
-          <w:b/>
-        </w:rPr>
-        <w:t>Programming &amp; data:</w:t>
-      </w:r>
-      <w:r>
-        <w:t xml:space="preserve"> Python, SQL, PostgreSQL, Pandas, NumPy, JavaScript and React.js.</w:t>
+        <w:t>KKBox customer churn baseline | Local prototype</w:t>
       </w:r>
     </w:p>
     <w:p>
       <w:pPr>
-        <w:keepLines/>
-        <w:spacing w:after="60"/>
+        <w:pStyle w:val="ListBullet"/>
       </w:pPr>
       <w:r>
-        <w:rPr>
-          <w:b/>
-        </w:rPr>
-        <w:t>Machine learning &amp; delivery:</w:t>
-      </w:r>
-      <w:r>
-        <w:t xml:space="preserve"> scikit-learn, LightGBM, XGBoost, PyTorch, Power BI/DAX and Streamlit.</w:t>
+        <w:t>Built a snapshot-date feature pipeline and logistic-regression holdout baseline for customer churn exploration.</w:t>
       </w:r>
     </w:p>
     <w:p>
       <w:pPr>
-        <w:keepLines/>
-        <w:spacing w:after="60"/>
+        <w:pStyle w:val="ListBullet"/>
       </w:pPr>
       <w:r>
-        <w:rPr>
-          <w:b/>
-        </w:rPr>
-        <w:t>Ways of working:</w:t>
-      </w:r>
-      <w:r>
-        <w:t xml:space="preserve"> Requirements analysis, debugging, testing, technical documentation; Claude Code and Codex-assisted development.</w:t>
+        <w:t>Checked future-event exclusion with synthetic fixtures. Real KKBox model scores and business outcomes remain unmeasured.</w:t>
       </w:r>
     </w:p>
     <w:p>
       <w:pPr>
-        <w:keepNext/>
-        <w:keepLines/>
-        <w:spacing w:before="200" w:after="100"/>
-        <w:pBdr>
-          <w:bottom w:val="single" w:sz="4" w:color="CCD8E0"/>
-        </w:pBdr>
+        <w:pStyle w:val="Heading2"/>
       </w:pPr>
       <w:r>
-        <w:rPr>
-          <w:b/>
-          <w:color w:val="225E7C"/>
-          <w:sz w:val="21"/>
-        </w:rPr>
-        <w:t>SELECTED AI &amp; DATA PROJECTS</w:t>
+        <w:t>Vibecode Product Kit | Public developer tool</w:t>
       </w:r>
     </w:p>
     <w:p>
       <w:pPr>
-        <w:keepNext/>
-        <w:keepLines/>
-        <w:spacing w:before="120" w:after="60"/>
+        <w:pStyle w:val="ListBullet"/>
       </w:pPr>
       <w:r>
-        <w:rPr>
-          <w:b/>
-          <w:sz w:val="21"/>
-        </w:rPr>
-        <w:t>AI Knowledge Assistant | RAG architecture and support-automation prototype</w:t>
+        <w:t>Maintained an offline JavaScript CLI with Codex agent profiles, skills, templates and CI checks for reviewable product work.</w:t>
       </w:r>
     </w:p>
     <w:p>
       <w:pPr>
-        <w:keepLines/>
-        <w:spacing w:after="80"/>
-        <w:ind w:left="187" w:hanging="187"/>
+        <w:pStyle w:val="ListBullet"/>
       </w:pPr>
       <w:r>
-        <w:t>• Designed a knowledge-assistant architecture combining semantic retrieval with LLM generation to answer questions from internal knowledge sources.</w:t>
+        <w:t>Public repository: github.com/DUYTRUYENTHONG/vibecode-product-kit. Adoption metrics are not claimed.</w:t>
       </w:r>
     </w:p>
     <w:p>
       <w:pPr>
-        <w:keepLines/>
-        <w:spacing w:after="80"/>
-        <w:ind w:left="187" w:hanging="187"/>
+        <w:pStyle w:val="Heading2"/>
       </w:pPr>
       <w:r>
-        <w:t>• Prototyped retrieval and prompt workflows, and evaluated responses across common knowledge-based query scenarios.</w:t>
+        <w:t>STOS Sales Traffic Operating System | Live product website</w:t>
       </w:r>
     </w:p>
     <w:p>
       <w:pPr>
-        <w:keepNext/>
-        <w:keepLines/>
-        <w:spacing w:before="120" w:after="60"/>
+        <w:pStyle w:val="ListBullet"/>
       </w:pPr>
       <w:r>
-        <w:rPr>
-          <w:b/>
-          <w:sz w:val="21"/>
-        </w:rPr>
-        <w:t>KKBox Customer Churn Prediction &amp; AI Action Center | May 2026</w:t>
+        <w:t>Built a public sales-page product with templates, a page studio, inquiry capture and an Insights workflow for views, actions and leads.</w:t>
       </w:r>
     </w:p>
     <w:p>
       <w:pPr>
-        <w:keepNext/>
-        <w:keepLines/>
-        <w:spacing w:after="80"/>
+        <w:pStyle w:val="ListBullet"/>
       </w:pPr>
       <w:r>
-        <w:rPr>
-          <w:i/>
-          <w:color w:val="516575"/>
-          <w:sz w:val="19"/>
-        </w:rPr>
-        <w:t>Python, SQL, PostgreSQL, LightGBM, Power BI, DAX, Gemini 2.5 Flash API</w:t>
-      </w:r>
-    </w:p>
-    <w:p>
-      <w:pPr>
-        <w:keepLines/>
-        <w:spacing w:after="80"/>
-        <w:ind w:left="187" w:hanging="187"/>
-      </w:pPr>
-      <w:r>
-        <w:t>• Integrated Gemini 2.5 Flash API to generate personalized push-notification copy for high-risk profiles; connected model outputs to a three-page Power BI dashboard with DAX measures.</w:t>
-      </w:r>
-    </w:p>
-    <w:p>
-      <w:pPr>
-        <w:keepLines/>
-        <w:spacing w:after="80"/>
-        <w:ind w:left="187" w:hanging="187"/>
-      </w:pPr>
-      <w:r>
-        <w:t>• Transformed 30M+ transaction records into a modeling dataset with SQL-based RFM features in PostgreSQL, reducing data volume by 97% before training.</w:t>
-      </w:r>
-    </w:p>
-    <w:p>
-      <w:pPr>
-        <w:keepLines/>
-        <w:spacing w:after="80"/>
-        <w:ind w:left="187" w:hanging="187"/>
-      </w:pPr>
-      <w:r>
-        <w:t>• Benchmarked LightGBM, XGBoost and Random Forest on 825K users; LightGBM achieved AUC-ROC of 0.9517 and 80% recall for the churned class.</w:t>
-      </w:r>
-    </w:p>
-    <w:p>
-      <w:pPr>
-        <w:keepNext/>
-        <w:keepLines/>
-        <w:spacing w:before="120" w:after="60"/>
-      </w:pPr>
-      <w:r>
-        <w:rPr>
-          <w:b/>
-          <w:sz w:val="21"/>
-        </w:rPr>
-        <w:t>Real-Time Pose Estimation &amp; AI Push-Up Counter | Mar 2026</w:t>
-      </w:r>
-    </w:p>
-    <w:p>
-      <w:pPr>
-        <w:keepLines/>
-        <w:spacing w:after="80"/>
-        <w:ind w:left="187" w:hanging="187"/>
-      </w:pPr>
-      <w:r>
-        <w:t>• Built a Streamlit application with RTMPose and a state machine for repetition tracking, using elbow angles and geometric posture checks for feedback.</w:t>
+        <w:t>AI suggestions are planned; customer adoption and business impact have not been independently measured.</w:t>
       </w:r>
     </w:p>
     <w:p>
@@ -304,255 +201,125 @@
     </w:p>
     <w:p>
       <w:pPr>
-        <w:spacing w:after="160"/>
+        <w:pStyle w:val="Title"/>
       </w:pPr>
       <w:r>
-        <w:rPr>
-          <w:b/>
-          <w:color w:val="16354D"/>
-          <w:sz w:val="24"/>
-        </w:rPr>
         <w:t>NGUYEN QUANG DUY</w:t>
       </w:r>
     </w:p>
     <w:p>
       <w:pPr>
-        <w:keepNext/>
-        <w:keepLines/>
-        <w:spacing w:before="200" w:after="100"/>
-        <w:pBdr>
-          <w:bottom w:val="single" w:sz="4" w:color="CCD8E0"/>
-        </w:pBdr>
+        <w:pStyle w:val="Heading1"/>
       </w:pPr>
       <w:r>
-        <w:rPr>
-          <w:b/>
-          <w:color w:val="225E7C"/>
-          <w:sz w:val="21"/>
-        </w:rPr>
         <w:t>PROFESSIONAL EXPERIENCE</w:t>
       </w:r>
     </w:p>
     <w:p>
       <w:pPr>
-        <w:keepNext/>
-        <w:keepLines/>
-        <w:spacing w:before="120" w:after="60"/>
+        <w:pStyle w:val="Heading2"/>
       </w:pPr>
       <w:r>
-        <w:rPr>
-          <w:b/>
-          <w:sz w:val="21"/>
-        </w:rPr>
-        <w:t>iTechWX | Microsoft Technical Support Specialist | Apr 2025–Present</w:t>
+        <w:t>iTechWX | Microsoft Technical Support Specialist | Apr 2025 - Present</w:t>
+      </w:r>
+    </w:p>
+    <w:p>
+      <w:r>
+        <w:t>Diagnose Microsoft 365 incidents across OneDrive, SharePoint, Exchange Online and Teams; reproduce symptoms, isolate causes, document evidence and coordinate escalations.</w:t>
       </w:r>
     </w:p>
     <w:p>
       <w:pPr>
-        <w:keepLines/>
-        <w:spacing w:after="80"/>
-        <w:ind w:left="187" w:hanging="187"/>
+        <w:pStyle w:val="Heading2"/>
       </w:pPr>
       <w:r>
-        <w:t>• Diagnose Microsoft 365 incidents across OneDrive, SharePoint, Exchange Online and Teams; reproduce symptoms, validate configurations and isolate root causes.</w:t>
+        <w:t>DUYTRUYENTHONG Agency | Founder and Operator | Feb 2024 - Present</w:t>
+      </w:r>
+    </w:p>
+    <w:p>
+      <w:r>
+        <w:t>Translate client goals into websites, content systems and commerce workflows. Build and test internal product prototypes and use Codex-assisted development with reviewable QA records.</w:t>
       </w:r>
     </w:p>
     <w:p>
       <w:pPr>
-        <w:keepLines/>
-        <w:spacing w:after="80"/>
-        <w:ind w:left="187" w:hanging="187"/>
+        <w:pStyle w:val="Heading2"/>
       </w:pPr>
       <w:r>
-        <w:t>• Use Admin Center, Message Trace, MX/DNS verification and PowerShell to test hypotheses and document technical evidence.</w:t>
+        <w:t>NINA Web Service | Solution Consultant | Dec 2023 - Dec 2024</w:t>
+      </w:r>
+    </w:p>
+    <w:p>
+      <w:r>
+        <w:t>Gather requirements, define website architecture and workflows, and align client needs with delivery scope.</w:t>
       </w:r>
     </w:p>
     <w:p>
       <w:pPr>
-        <w:keepLines/>
-        <w:spacing w:after="80"/>
-        <w:ind w:left="187" w:hanging="187"/>
+        <w:pStyle w:val="Heading2"/>
       </w:pPr>
       <w:r>
-        <w:t>• Own incidents from intake through verification: communicate with enterprise stakeholders, coordinate escalations to Microsoft engineering and contribute reusable troubleshooting knowledge.</w:t>
+        <w:t>NINA Web Service | Web Developer | Jun 2023 - Dec 2023</w:t>
+      </w:r>
+    </w:p>
+    <w:p>
+      <w:r>
+        <w:t>Developed React and JavaScript features; debugged and tested interfaces; prototyped a retrieval-based support chatbot.</w:t>
       </w:r>
     </w:p>
     <w:p>
       <w:pPr>
-        <w:keepNext/>
-        <w:keepLines/>
-        <w:spacing w:before="120" w:after="60"/>
+        <w:pStyle w:val="Heading2"/>
       </w:pPr>
       <w:r>
-        <w:rPr>
-          <w:b/>
-          <w:sz w:val="21"/>
-        </w:rPr>
-        <w:t>DUYTRUYENTHONG Agency | Founder &amp; Operator | Feb 2024–Present</w:t>
+        <w:t>Amazing Tech | Junior Front-End Developer | Sep 2022 - Jan 2023</w:t>
+      </w:r>
+    </w:p>
+    <w:p>
+      <w:r>
+        <w:t>Supported responsive UI work, front-end refactoring, debugging and code-maintainability improvements.</w:t>
       </w:r>
     </w:p>
     <w:p>
       <w:pPr>
-        <w:keepLines/>
-        <w:spacing w:after="80"/>
-        <w:ind w:left="187" w:hanging="187"/>
+        <w:pStyle w:val="Heading1"/>
       </w:pPr>
       <w:r>
-        <w:t>• Translate client goals into websites, content systems and digital workflows; use Claude Code and Codex for rapid prototyping, service tooling and internal automation.</w:t>
+        <w:t>EDUCATION AND LANGUAGES</w:t>
       </w:r>
     </w:p>
     <w:p>
-      <w:pPr>
-        <w:keepLines/>
-        <w:spacing w:after="80"/>
-        <w:ind w:left="187" w:hanging="187"/>
-      </w:pPr>
       <w:r>
-        <w:t>• Build products including Cho Kenh, a TikTok marketplace/community concept, and STOS, a sales-portfolio and traffic-to-sales system.</w:t>
+        <w:t>Bachelor of Computer Science | Vietnamese-German University | 2021 - 2026</w:t>
       </w:r>
     </w:p>
     <w:p>
-      <w:pPr>
-        <w:keepNext/>
-        <w:keepLines/>
-        <w:spacing w:before="120" w:after="60"/>
-      </w:pPr>
-      <w:r>
-        <w:rPr>
-          <w:b/>
-          <w:sz w:val="21"/>
-        </w:rPr>
-        <w:t>NINA Web Service | Solution Consultant | Dec 2023–Dec 2024</w:t>
-      </w:r>
-    </w:p>
-    <w:p>
-      <w:pPr>
-        <w:keepLines/>
-        <w:spacing w:after="80"/>
-        <w:ind w:left="187" w:hanging="187"/>
-      </w:pPr>
-      <w:r>
-        <w:t>• Gathered business objectives, operational constraints and user needs; translated them into website architecture, UX, functionality and implementation requirements.</w:t>
-      </w:r>
-    </w:p>
-    <w:p>
-      <w:pPr>
-        <w:keepLines/>
-        <w:spacing w:after="80"/>
-        <w:ind w:left="187" w:hanging="187"/>
-      </w:pPr>
-      <w:r>
-        <w:t>• Coordinated with clients and developers to align feasibility, scope and delivery, and recommended practical digital solutions.</w:t>
-      </w:r>
-    </w:p>
-    <w:p>
-      <w:pPr>
-        <w:keepNext/>
-        <w:keepLines/>
-        <w:spacing w:before="120" w:after="60"/>
-      </w:pPr>
-      <w:r>
-        <w:rPr>
-          <w:b/>
-          <w:sz w:val="21"/>
-        </w:rPr>
-        <w:t>NINA Web Service | Web Developer | Jun 2023–Dec 2023</w:t>
-      </w:r>
-    </w:p>
-    <w:p>
-      <w:pPr>
-        <w:keepLines/>
-        <w:spacing w:after="80"/>
-        <w:ind w:left="187" w:hanging="187"/>
-      </w:pPr>
-      <w:r>
-        <w:t>• Developed React.js/JavaScript interfaces and application features; performed debugging, testing, integration and iterative improvements.</w:t>
-      </w:r>
-    </w:p>
-    <w:p>
-      <w:pPr>
-        <w:keepLines/>
-        <w:spacing w:after="80"/>
-        <w:ind w:left="187" w:hanging="187"/>
-      </w:pPr>
-      <w:r>
-        <w:t>• Prototyped an AI-powered support chatbot using AI-agent and retrieval-augmented generation concepts for knowledge-based assistance.</w:t>
-      </w:r>
-    </w:p>
-    <w:p>
-      <w:pPr>
-        <w:keepNext/>
-        <w:keepLines/>
-        <w:spacing w:before="120" w:after="60"/>
-      </w:pPr>
-      <w:r>
-        <w:rPr>
-          <w:b/>
-          <w:sz w:val="21"/>
-        </w:rPr>
-        <w:t>Amazing Tech | Junior Front-End Developer | Sep 2022–Jan 2023</w:t>
-      </w:r>
-    </w:p>
-    <w:p>
-      <w:pPr>
-        <w:keepLines/>
-        <w:spacing w:after="80"/>
-        <w:ind w:left="187" w:hanging="187"/>
-      </w:pPr>
-      <w:r>
-        <w:t>• Supported front-end refactoring, responsive UI implementation, debugging and code-maintainability improvements alongside senior developers.</w:t>
-      </w:r>
-    </w:p>
-    <w:p>
-      <w:pPr>
-        <w:keepNext/>
-        <w:keepLines/>
-        <w:spacing w:before="200" w:after="100"/>
-        <w:pBdr>
-          <w:bottom w:val="single" w:sz="4" w:color="CCD8E0"/>
-        </w:pBdr>
-      </w:pPr>
-      <w:r>
-        <w:rPr>
-          <w:b/>
-          <w:color w:val="225E7C"/>
-          <w:sz w:val="21"/>
-        </w:rPr>
-        <w:t>EDUCATION &amp; LANGUAGES</w:t>
-      </w:r>
-    </w:p>
-    <w:p>
-      <w:pPr>
-        <w:keepLines/>
-        <w:spacing w:after="80"/>
-      </w:pPr>
-      <w:r>
-        <w:rPr>
-          <w:b/>
-        </w:rPr>
-        <w:t>Bachelor of Computer Science | Vietnamese-German University | 2021–2026</w:t>
-      </w:r>
-    </w:p>
-    <w:p>
-      <w:pPr>
-        <w:keepLines/>
-      </w:pPr>
       <w:r>
         <w:t>Selected coursework: Linear Algebra, Statistics and Discrete Mathematics.</w:t>
       </w:r>
     </w:p>
     <w:p>
-      <w:pPr>
-        <w:keepLines/>
-      </w:pPr>
       <w:r>
         <w:t>English: Professional Working Proficiency | German: A2</w:t>
       </w:r>
     </w:p>
+    <w:p>
+      <w:pPr>
+        <w:pStyle w:val="Heading1"/>
+      </w:pPr>
+      <w:r>
+        <w:t>EVIDENCE AND SCOPE</w:t>
+      </w:r>
+    </w:p>
+    <w:p>
+      <w:r>
+        <w:t>Live websites and the public Vibecode repository can be inspected through the portfolio. The knowledge assistant and KKBox work are prototypes. No production AI deployment, KKBox model score or commercial uplift is claimed in this CV.</w:t>
+      </w:r>
+    </w:p>
     <w:sectPr>
       <w:footerReference w:type="default" r:id="rId9"/>
-      <w:pgSz w:w="11909" w:h="16834"/>
-      <w:pgMar w:top="893" w:right="1008" w:bottom="864" w:left="1008" w:header="360" w:footer="403" w:gutter="0"/>
+      <w:pgSz w:w="12240" w:h="15840"/>
+      <w:pgMar w:top="936" w:right="1008" w:bottom="893" w:left="1008" w:header="720" w:footer="720" w:gutter="0"/>
       <w:cols w:space="720"/>
       <w:docGrid w:linePitch="360"/>
     </w:sectPr>
@@ -568,13 +335,8 @@
       <w:jc w:val="right"/>
     </w:pPr>
     <w:r>
-      <w:rPr>
-        <w:color w:val="687684"/>
-        <w:sz w:val="16"/>
-      </w:rPr>
-      <w:t xml:space="preserve">NGUYEN QUANG DUY  |  </w:t>
+      <w:t>NGUYEN QUANG DUY | AI AND PROMPT ENGINEERING</w:t>
     </w:r>
-    <w:fldSimple w:instr="PAGE"/>
   </w:p>
 </w:ftr>
 </file>
@@ -943,12 +705,12 @@
     <w:qFormat/>
     <w:rsid w:val="00FC693F"/>
     <w:pPr>
-      <w:widowControl/>
-      <w:spacing w:after="100" w:line="259" w:lineRule="auto"/>
+      <w:spacing w:after="80"/>
     </w:pPr>
     <w:rPr>
-      <w:rFonts w:ascii="Calibri" w:hAnsi="Calibri"/>
-      <w:sz w:val="21"/>
+      <w:rFonts w:ascii="Aptos" w:hAnsi="Aptos"/>
+      <w:color w:val="17212D"/>
+      <w:sz w:val="18"/>
     </w:rPr>
   </w:style>
   <w:style w:type="paragraph" w:styleId="Header">
@@ -1006,15 +768,15 @@
     <w:pPr>
       <w:keepNext/>
       <w:keepLines/>
-      <w:spacing w:before="480" w:after="0"/>
+      <w:spacing w:before="200" w:after="80"/>
       <w:outlineLvl w:val="0"/>
     </w:pPr>
     <w:rPr>
-      <w:rFonts w:asciiTheme="majorHAnsi" w:eastAsiaTheme="majorEastAsia" w:hAnsiTheme="majorHAnsi" w:cstheme="majorBidi" w:ascii="Calibri" w:hAnsi="Calibri"/>
+      <w:rFonts w:asciiTheme="majorHAnsi" w:eastAsiaTheme="majorEastAsia" w:hAnsiTheme="majorHAnsi" w:cstheme="majorBidi" w:ascii="Aptos Display" w:hAnsi="Aptos Display"/>
       <w:b/>
       <w:bCs/>
-      <w:color w:val="365F91" w:themeColor="accent1" w:themeShade="BF"/>
-      <w:sz w:val="28"/>
+      <w:color w:val="125D83"/>
+      <w:sz w:val="20"/>
       <w:szCs w:val="28"/>
     </w:rPr>
   </w:style>
@@ -1030,15 +792,15 @@
     <w:pPr>
       <w:keepNext/>
       <w:keepLines/>
-      <w:spacing w:before="200" w:after="0"/>
+      <w:spacing w:before="120" w:after="40"/>
       <w:outlineLvl w:val="1"/>
     </w:pPr>
     <w:rPr>
-      <w:rFonts w:asciiTheme="majorHAnsi" w:eastAsiaTheme="majorEastAsia" w:hAnsiTheme="majorHAnsi" w:cstheme="majorBidi" w:ascii="Calibri" w:hAnsi="Calibri"/>
+      <w:rFonts w:asciiTheme="majorHAnsi" w:eastAsiaTheme="majorEastAsia" w:hAnsiTheme="majorHAnsi" w:cstheme="majorBidi" w:ascii="Aptos Display" w:hAnsi="Aptos Display"/>
       <w:b/>
       <w:bCs/>
-      <w:color w:val="4F81BD" w:themeColor="accent1"/>
-      <w:sz w:val="26"/>
+      <w:color w:val="125D83"/>
+      <w:sz w:val="18"/>
       <w:szCs w:val="26"/>
     </w:rPr>
   </w:style>
@@ -1299,11 +1061,11 @@
       <w:contextualSpacing/>
     </w:pPr>
     <w:rPr>
-      <w:rFonts w:asciiTheme="majorHAnsi" w:eastAsiaTheme="majorEastAsia" w:hAnsiTheme="majorHAnsi" w:cstheme="majorBidi" w:ascii="Calibri" w:hAnsi="Calibri"/>
-      <w:color w:val="17365D" w:themeColor="text2" w:themeShade="BF"/>
+      <w:rFonts w:asciiTheme="majorHAnsi" w:eastAsiaTheme="majorEastAsia" w:hAnsiTheme="majorHAnsi" w:cstheme="majorBidi" w:ascii="Aptos Display" w:hAnsi="Aptos Display"/>
+      <w:color w:val="17212D"/>
       <w:spacing w:val="5"/>
       <w:kern w:val="28"/>
-      <w:sz w:val="52"/>
+      <w:sz w:val="38"/>
       <w:szCs w:val="52"/>
     </w:rPr>
   </w:style>
@@ -1336,7 +1098,7 @@
       </w:numPr>
     </w:pPr>
     <w:rPr>
-      <w:rFonts w:asciiTheme="majorHAnsi" w:eastAsiaTheme="majorEastAsia" w:hAnsiTheme="majorHAnsi" w:cstheme="majorBidi" w:ascii="Calibri" w:hAnsi="Calibri"/>
+      <w:rFonts w:asciiTheme="majorHAnsi" w:eastAsiaTheme="majorEastAsia" w:hAnsiTheme="majorHAnsi" w:cstheme="majorBidi"/>
       <w:i/>
       <w:iCs/>
       <w:color w:val="4F81BD" w:themeColor="accent1"/>

</xml_diff>

<commit_message>
Improve portfolio evidence, work discovery, and visual explanations
</commit_message>
<xml_diff>
--- a/public/cv-prompt-engineer.docx
+++ b/public/cv-prompt-engineer.docx
@@ -143,7 +143,7 @@
         <w:pStyle w:val="ListBullet"/>
       </w:pPr>
       <w:r>
-        <w:t>Checked future-event exclusion with synthetic fixtures. Real KKBox model scores and business outcomes remain unmeasured.</w:t>
+        <w:t>Checked future-event exclusion with synthetic fixtures. On 970,960 official-data labels, a local within-cohort 75/25 stratified holdout reached 0.217324 log loss and 0.819295 ROC AUC. Features use a 2017-02-28 snapshot; this is not an out-of-time, leaderboard, production or business-impact result.</w:t>
       </w:r>
     </w:p>
     <w:p>
@@ -313,7 +313,7 @@
     </w:p>
     <w:p>
       <w:r>
-        <w:t>Live websites and the public Vibecode repository can be inspected through the portfolio. The knowledge assistant and KKBox work are prototypes. No production AI deployment, KKBox model score or commercial uplift is claimed in this CV.</w:t>
+        <w:t>Live websites and public source can be inspected through the portfolio. The knowledge assistant and KKBox work are prototypes. The KKBox score is from a local within-cohort holdout; no production AI deployment or commercial uplift is claimed.</w:t>
       </w:r>
     </w:p>
     <w:sectPr>

</xml_diff>

<commit_message>
feat: publish engineering evidence and update AI CVs
</commit_message>
<xml_diff>
--- a/public/cv-prompt-engineer.docx
+++ b/public/cv-prompt-engineer.docx
@@ -12,7 +12,7 @@
     </w:p>
     <w:p>
       <w:r>
-        <w:t>AI AND PROMPT ENGINEER | RAG PROTOTYPES | PYTHON</w:t>
+        <w:t>AI AND PROMPT ENGINEER | RETRIEVAL AND EVALUATION | PYTHON</w:t>
       </w:r>
     </w:p>
     <w:p>
@@ -35,7 +35,7 @@
     </w:p>
     <w:p>
       <w:r>
-        <w:t>Computer Science graduate building applied AI prototypes, customer-data workflows and digital products. Work spans retrieval and prompt design, a leakage-checked local churn baseline, public developer tooling and live commerce websites. I bring enterprise troubleshooting and client discovery to scoping, testing and explaining technical work.</w:t>
+        <w:t>Computer Science graduate building source-grounded AI applications, SQL data pipelines and digital products. Public work includes a live portfolio guide with a recorded evaluation, a locally verified PostgreSQL warehouse, and a leakage-checked churn baseline. I bring enterprise troubleshooting and client discovery to scoping and testing technical work.</w:t>
       </w:r>
     </w:p>
     <w:p>
@@ -54,7 +54,7 @@
         <w:t xml:space="preserve">Applied AI: </w:t>
       </w:r>
       <w:r>
-        <w:t>LLM API and prompt workflows; retrieval-augmented generation prototypes; response review and documentation.</w:t>
+        <w:t>LLM APIs, source retrieval, prompt workflows, citation checks and regression evaluation.</w:t>
       </w:r>
     </w:p>
     <w:p>
@@ -65,7 +65,7 @@
         <w:t xml:space="preserve">Data and evaluation: </w:t>
       </w:r>
       <w:r>
-        <w:t>Python, SQL, PostgreSQL, Pandas, scikit-learn, snapshot-date features and holdout evaluation.</w:t>
+        <w:t>Python, SQL, PostgreSQL, Upstash Redis, transactional batch loading, Pandas and scikit-learn.</w:t>
       </w:r>
     </w:p>
     <w:p>
@@ -103,7 +103,7 @@
         <w:pStyle w:val="Heading2"/>
       </w:pPr>
       <w:r>
-        <w:t>AI Knowledge Assistant | Retrieval and prompt prototype</w:t>
+        <w:t>Portfolio AI guide | Live application and baseline evaluation</w:t>
       </w:r>
     </w:p>
     <w:p>
@@ -111,7 +111,7 @@
         <w:pStyle w:val="ListBullet"/>
       </w:pPr>
       <w:r>
-        <w:t>Designed a retrieval-plus-generation flow for answering questions from internal knowledge sources.</w:t>
+        <w:t>Built approved-source retrieval and LLM API responses with server-controlled citations, rate limits and a labelled source-excerpt fallback.</w:t>
       </w:r>
     </w:p>
     <w:p>
@@ -119,7 +119,31 @@
         <w:pStyle w:val="ListBullet"/>
       </w:pPr>
       <w:r>
-        <w:t>Prototyped prompt and retrieval steps and reviewed responses to representative knowledge questions. No production deployment or measured accuracy is claimed.</w:t>
+        <w:t>A 16-request live baseline returned 12 HTTP 200 responses and four service errors; 9 passed the original heuristics. This is not factual accuracy; the full post-fix evaluation is pending.</w:t>
+      </w:r>
+    </w:p>
+    <w:p>
+      <w:pPr>
+        <w:pStyle w:val="Heading2"/>
+      </w:pPr>
+      <w:r>
+        <w:t>Traffic analytics pipeline | Locally verified PostgreSQL</w:t>
+      </w:r>
+    </w:p>
+    <w:p>
+      <w:pPr>
+        <w:pStyle w:val="ListBullet"/>
+      </w:pPr>
+      <w:r>
+        <w:t>Built daily Upstash aggregate export, validated snapshots, transactional replay protection, corrections and SQL reporting views without exporting visitor identifiers.</w:t>
+      </w:r>
+    </w:p>
+    <w:p>
+      <w:pPr>
+        <w:pStyle w:val="ListBullet"/>
+      </w:pPr>
+      <w:r>
+        <w:t>Ten tests cover load behavior and persistence. A real aggregate snapshot loaded and replayed in local PGlite PostgreSQL; public demonstrations are synthetic. Hosted deployment is pending.</w:t>
       </w:r>
     </w:p>
     <w:p>
@@ -168,30 +192,6 @@
       </w:pPr>
       <w:r>
         <w:t>Public repository: github.com/DUYTRUYENTHONG/vibecode-product-kit. Adoption metrics are not claimed.</w:t>
-      </w:r>
-    </w:p>
-    <w:p>
-      <w:pPr>
-        <w:pStyle w:val="Heading2"/>
-      </w:pPr>
-      <w:r>
-        <w:t>STOS Sales Traffic Operating System | Live product website</w:t>
-      </w:r>
-    </w:p>
-    <w:p>
-      <w:pPr>
-        <w:pStyle w:val="ListBullet"/>
-      </w:pPr>
-      <w:r>
-        <w:t>Built a public sales-page product with templates, a page studio, inquiry capture and an Insights workflow for views, actions and leads.</w:t>
-      </w:r>
-    </w:p>
-    <w:p>
-      <w:pPr>
-        <w:pStyle w:val="ListBullet"/>
-      </w:pPr>
-      <w:r>
-        <w:t>AI suggestions are planned; customer adoption and business impact have not been independently measured.</w:t>
       </w:r>
     </w:p>
     <w:p>
@@ -313,7 +313,12 @@
     </w:p>
     <w:p>
       <w:r>
-        <w:t>Live websites and public source can be inspected through the portfolio. The knowledge assistant and KKBox work are prototypes. The KKBox score is from a local within-cohort holdout; no production AI deployment or commercial uplift is claimed.</w:t>
+        <w:t>The portfolio guide is live; its published evaluation is a small authored baseline with failures retained. The PostgreSQL warehouse is verified locally with PGlite; hosted operation is pending. KKBox is a local within-cohort holdout. Customer adoption and commercial uplift are not claimed.</w:t>
+      </w:r>
+    </w:p>
+    <w:p>
+      <w:r>
+        <w:t>Evidence and reproducible reports: https://duytruyenthong.github.io/Alinguyen-portfolio/evidence/</w:t>
       </w:r>
     </w:p>
     <w:sectPr>
@@ -708,7 +713,7 @@
       <w:spacing w:after="80"/>
     </w:pPr>
     <w:rPr>
-      <w:rFonts w:ascii="Aptos" w:hAnsi="Aptos"/>
+      <w:rFonts w:ascii="Arial" w:hAnsi="Arial"/>
       <w:color w:val="17212D"/>
       <w:sz w:val="18"/>
     </w:rPr>
@@ -772,7 +777,7 @@
       <w:outlineLvl w:val="0"/>
     </w:pPr>
     <w:rPr>
-      <w:rFonts w:asciiTheme="majorHAnsi" w:eastAsiaTheme="majorEastAsia" w:hAnsiTheme="majorHAnsi" w:cstheme="majorBidi" w:ascii="Aptos Display" w:hAnsi="Aptos Display"/>
+      <w:rFonts w:ascii="Arial" w:hAnsi="Arial"/>
       <w:b/>
       <w:bCs/>
       <w:color w:val="125D83"/>
@@ -796,7 +801,7 @@
       <w:outlineLvl w:val="1"/>
     </w:pPr>
     <w:rPr>
-      <w:rFonts w:asciiTheme="majorHAnsi" w:eastAsiaTheme="majorEastAsia" w:hAnsiTheme="majorHAnsi" w:cstheme="majorBidi" w:ascii="Aptos Display" w:hAnsi="Aptos Display"/>
+      <w:rFonts w:ascii="Arial" w:hAnsi="Arial"/>
       <w:b/>
       <w:bCs/>
       <w:color w:val="125D83"/>
@@ -1054,14 +1059,11 @@
     <w:qFormat/>
     <w:rsid w:val="00FC693F"/>
     <w:pPr>
-      <w:pBdr>
-        <w:bottom w:val="single" w:sz="8" w:space="4" w:color="4F81BD" w:themeColor="accent1"/>
-      </w:pBdr>
       <w:spacing w:after="300" w:line="240" w:lineRule="auto"/>
       <w:contextualSpacing/>
     </w:pPr>
     <w:rPr>
-      <w:rFonts w:asciiTheme="majorHAnsi" w:eastAsiaTheme="majorEastAsia" w:hAnsiTheme="majorHAnsi" w:cstheme="majorBidi" w:ascii="Aptos Display" w:hAnsi="Aptos Display"/>
+      <w:rFonts w:ascii="Arial" w:hAnsi="Arial"/>
       <w:color w:val="17212D"/>
       <w:spacing w:val="5"/>
       <w:kern w:val="28"/>
@@ -1241,6 +1243,9 @@
       </w:numPr>
       <w:contextualSpacing/>
     </w:pPr>
+    <w:rPr>
+      <w:rFonts/>
+    </w:rPr>
   </w:style>
   <w:style w:type="paragraph" w:styleId="ListBullet2">
     <w:name w:val="List Bullet 2"/>
@@ -1541,9 +1546,6 @@
     <w:qFormat/>
     <w:rsid w:val="00FC693F"/>
     <w:pPr>
-      <w:pBdr>
-        <w:bottom w:val="single" w:sz="4" w:space="4" w:color="4F81BD" w:themeColor="accent1"/>
-      </w:pBdr>
       <w:spacing w:before="200" w:after="280"/>
       <w:ind w:left="936" w:right="936"/>
     </w:pPr>

</xml_diff>